<commit_message>
Add phone number to resumes
</commit_message>
<xml_diff>
--- a/resumes/Brendin_Van_Niekerk_Resume_Editor.docx
+++ b/resumes/Brendin_Van_Niekerk_Resume_Editor.docx
@@ -45,9 +45,9 @@
           <w:sz w:val="19"/>
           <w:szCs w:val="19"/>
         </w:rPr>
-        <w:t xml:space="preserve">Indiana  |  forecastplusllc@gmail.com  |  </w:t>
-      </w:r>
-      <w:hyperlink w:history="1" r:id="rIdlt6gk6ir8usd8fci4eplx">
+        <w:t xml:space="preserve">Indiana  |  (574) 780-9499  |  forecastplusllc@gmail.com  |  </w:t>
+      </w:r>
+      <w:hyperlink w:history="1" r:id="rIdgdbrvqgeoidjifesj4dq9">
         <w:r>
           <w:rPr>
             <w:color w:val="1155CC"/>

</xml_diff>